<commit_message>
调整"True Label" should be on the x axis and "Predicted Label" should be on the y axis.
</commit_message>
<xml_diff>
--- a/Lab 1 bonus questions_answer.docx
+++ b/Lab 1 bonus questions_answer.docx
@@ -83,9 +83,9 @@
           <w:noProof/>
         </w:rPr>
         <w:drawing>
-          <wp:inline distT="0" distB="0" distL="0" distR="0" wp14:anchorId="5EDAC4A3" wp14:editId="385E9609">
-            <wp:extent cx="4029075" cy="3021564"/>
-            <wp:effectExtent l="0" t="0" r="0" b="7620"/>
+          <wp:inline distT="0" distB="0" distL="0" distR="0" wp14:anchorId="5EDAC4A3" wp14:editId="2D4B164C">
+            <wp:extent cx="5474139" cy="4105275"/>
+            <wp:effectExtent l="0" t="0" r="0" b="0"/>
             <wp:docPr id="1473300447" name="图片 1"/>
             <wp:cNvGraphicFramePr>
               <a:graphicFrameLocks xmlns:a="http://schemas.openxmlformats.org/drawingml/2006/main" noChangeAspect="1"/>
@@ -106,7 +106,7 @@
                   <pic:spPr>
                     <a:xfrm>
                       <a:off x="0" y="0"/>
-                      <a:ext cx="4034485" cy="3025621"/>
+                      <a:ext cx="5510646" cy="4132653"/>
                     </a:xfrm>
                     <a:prstGeom prst="rect">
                       <a:avLst/>
@@ -169,6 +169,7 @@
     </w:p>
     <w:p>
       <w:r>
+        <w:lastRenderedPageBreak/>
         <w:t>Distinctive</w:t>
       </w:r>
       <w:r>
@@ -189,7 +190,6 @@
         <w:rPr>
           <w:noProof/>
         </w:rPr>
-        <w:lastRenderedPageBreak/>
         <w:drawing>
           <wp:inline distT="0" distB="0" distL="0" distR="0" wp14:anchorId="6DEBF3C6" wp14:editId="18AAEECB">
             <wp:extent cx="1104900" cy="968751"/>

</xml_diff>